<commit_message>
auto: session 2026-09-16 11:02
Co-Authored-By: Claude Opus 4.8 (1M context) <noreply@anthropic.com>
</commit_message>
<xml_diff>
--- a/AP/Ban-thao-CafeBiz-AP-Vietnam-10-nam-2026-09-15.docx
+++ b/AP/Ban-thao-CafeBiz-AP-Vietnam-10-nam-2026-09-15.docx
@@ -100,11 +100,26 @@
       </w:r>
     </w:p>
     <w:p>
+      <w:r>
+        <w:t>Nhìn xa hơn, bà Loan cho rằng vai trò lãnh đạo trong 5-10 năm tới sẽ theo mô hình bà gọi là "AI + Leadership": người đứng đầu vừa làm chủ công nghệ cho bản thân, vừa giúp đội ngũ ứng dụng công nghệ hiệu quả, đồng thời vẫn phải trực tiếp dẫn dắt con người. Bà cho rằng bốn năng lực sẽ trở nên quan trọng hơn cả trong giai đoạn này: dẫn dắt đội ngũ trong bối cảnh thay đổi liên tục thay vì thay đổi một lần; dẫn dắt song song cả con người và AI mà không đánh mất kết nối cảm xúc; gắn chiến lược với thực thi để chiến lược tốt không bị chững lại vì thực thi yếu; và chủ động chuẩn bị thế hệ lãnh đạo kế thừa cho tổ chức.</w:t>
+      </w:r>
+    </w:p>
+    <w:p>
+      <w:r>
+        <w:t>Trong các chương trình đồng hành cùng doanh nghiệp, bà Loan nhận ra ba dịch chuyển tư duy rõ nhất ở người lãnh đạo được A&amp;P Việt Nam huấn luyện: từ tư duy "cá nhân đóng góp" sang tư duy "thành công của tôi là thành công của cả đội ngũ"; từ việc luôn đưa sẵn đáp án sang biết đặt câu hỏi để khai phá tiềm năng người khác; và từ chỗ chỉ quan tâm "mình cần học gì" sang việc nhìn rõ giá trị mình tạo ra cho đội ngũ - đo bằng khả năng đội nhóm vẫn vận hành tốt ngay cả khi người quản lý vắng mặt. Theo bà, đây chính là phần việc mà công nghệ khó chạm tới, dù AI có thể hỗ trợ rất tốt ở khâu soạn thảo, phân tích dữ liệu hay tổng hợp thông tin.</w:t>
+      </w:r>
+    </w:p>
+    <w:p>
       <w:pPr>
         <w:spacing w:after="200"/>
       </w:pPr>
       <w:r>
         <w:t xml:space="preserve">A&amp;P Việt Nam được bà Loan thành lập năm 2016, sau hơn 22 năm giữ các vị trí lãnh đạo kinh doanh và nhân sự tại nhiều tập đoàn đa quốc gia như Abbott, GSK, MSD, Liberty Insurance, AIA và DKSH. Công ty hiện là đối tác chiến lược tại Việt Nam của Development Dimensions International (DDI) - tổ chức quốc tế có hơn 50 năm nghiên cứu về lãnh đạo và hơn 75% đối tác thuộc danh sách Fortune 500, với hơn 95% khách hàng của A&amp;P là các tập đoàn đa quốc gia và doanh nghiệp lớn tại Việt Nam.</w:t>
+      </w:r>
+    </w:p>
+    <w:p>
+      <w:r>
+        <w:t>A&amp;P ra đời không từ một ý tưởng kinh doanh, mà từ niềm tin rằng chiến lược đúng vẫn chưa đủ để doanh nghiệp thành công - yếu tố quyết định vẫn là con người trực tiếp thực thi chiến lược đó. Đến nay, mỗi năm công ty triển khai hơn 150 dự án tư vấn - đào tạo cho các đối tác tại Việt Nam.</w:t>
       </w:r>
     </w:p>
     <w:p>

</xml_diff>

<commit_message>
auto: session 2026-09-16 11:14
Co-Authored-By: Claude Opus 4.8 (1M context) <noreply@anthropic.com>
</commit_message>
<xml_diff>
--- a/AP/Ban-thao-CafeBiz-AP-Vietnam-10-nam-2026-09-15.docx
+++ b/AP/Ban-thao-CafeBiz-AP-Vietnam-10-nam-2026-09-15.docx
@@ -110,6 +110,26 @@
       </w:r>
     </w:p>
     <w:p>
+      <w:r>
+        <w:t>Với bà Loan, tố chất chỉ là một điểm cộng, không phải điều kiện duy nhất để trở thành lãnh đạo. Quan điểm của A&amp;P Việt Nam là đi từ tổ chức cần gì, vị trí cần gì, rồi mới đến con người cần gì - thay vì chọn một cá nhân có tố chất rồi áp ngược lại. Để được xem là nhân sự tiềm năng xứng đáng đầu tư phát triển thành lãnh đạo, một người phải chứng minh được hai điều: hiệu suất công việc nhất quán theo thời gian, và tiềm năng dẫn dắt được một đội nhóm - điều khác hẳn với việc chỉ giỏi chuyên môn cá nhân. "Người chưa có sẵn tố chất vẫn hoàn toàn có thể được đào tạo để phát triển, nếu có chiến lược bài bản", bà nói.</w:t>
+      </w:r>
+    </w:p>
+    <w:p>
+      <w:r>
+        <w:t>Cách tiếp cận đó được thể hiện rõ qua một dự án A&amp;P từng triển khai cho một nhà máy sản xuất quy mô lớn thuộc một tập đoàn đa quốc gia (thông tin đối tác được giữ kín theo thỏa thuận bảo mật). Đối tác này xác định "giải quyết vấn đề" là một năng lực lõi cần có ở đội quản lý, và đề nghị A&amp;P tổ chức một khóa đào tạo problem solving. Nếu chỉ dừng ở một khóa học thông thường, bà Loan cho rằng khó tạo ra thay đổi hành vi lâu dài, càng khó biến thành năng lực lõi thật sự của tổ chức. A&amp;P vì vậy đề xuất một cách làm toàn diện hơn: khóa học chỉ là điểm khởi đầu, sau đó học viên phải áp dụng để giải quyết đúng vấn đề thật của nhà máy, dưới hai tầng kèm cặp song song - một bởi chuyên gia A&amp;P, một bởi chính các quản lý cấp trên trong nội bộ. Để nhân rộng bền vững, A&amp;P còn chọn ra một nhóm lãnh đạo cấp cao có năng lực giảng dạy, huấn luyện lại chính nhóm này về kỹ năng dẫn dắt và giải quyết vấn đề, để họ tự đào tạo cho các thế hệ tiếp theo mà không phải phụ thuộc mãi vào bên tư vấn.</w:t>
+      </w:r>
+    </w:p>
+    <w:p>
+      <w:r>
+        <w:t>Với bà Loan, đây cũng chính là minh chứng cho quan điểm về AI: công nghệ có thể hỗ trợ phân tích dữ liệu, soạn tài liệu đào tạo rất nhanh, nhưng phần việc kèm cặp, truyền cảm hứng và huấn luyện lại đồng nghiệp - yếu tố quyết định thành công của dự án - vẫn phải do chính con người thực hiện.</w:t>
+      </w:r>
+    </w:p>
+    <w:p>
+      <w:r>
+        <w:t>[ẢNH] Bà Võ Thị Thanh Loan trực tiếp huấn luyện một buổi đào tạo lãnh đạo cho doanh nghiệp đối tác.</w:t>
+      </w:r>
+    </w:p>
+    <w:p>
       <w:pPr>
         <w:spacing w:after="200"/>
       </w:pPr>
@@ -120,6 +140,21 @@
     <w:p>
       <w:r>
         <w:t>A&amp;P ra đời không từ một ý tưởng kinh doanh, mà từ niềm tin rằng chiến lược đúng vẫn chưa đủ để doanh nghiệp thành công - yếu tố quyết định vẫn là con người trực tiếp thực thi chiến lược đó. Đến nay, mỗi năm công ty triển khai hơn 150 dự án tư vấn - đào tạo cho các đối tác tại Việt Nam.</w:t>
+      </w:r>
+    </w:p>
+    <w:p>
+      <w:r>
+        <w:t>A&amp;P Việt Nam hiện đặt trụ sở tại số 36 Mạc Đĩnh Chi, Phường Đa Kao, Quận 1, TP.HCM. Thông tin chi tiết về các chương trình tư vấn và đào tạo lãnh đạo của công ty được cập nhật tại website apconsulting.vn.</w:t>
+      </w:r>
+    </w:p>
+    <w:p>
+      <w:r>
+        <w:t>[ẢNH] Không gian văn phòng làm việc của A&amp;P Việt Nam tại TP.HCM.</w:t>
+      </w:r>
+    </w:p>
+    <w:p>
+      <w:r>
+        <w:t>A&amp;P Việt Nam theo đuổi sứ mệnh "Thay đổi nhận thức - Nâng cao năng lực - Phát triển trường tồn", dựa trên bốn giá trị cốt lõi: chuyên nghiệp, đề cao chữ tín, lấy khách hàng làm trọng tâm và tiên phong trong đổi mới - sáng tạo. Đây cũng là những tiêu chí công ty áp dụng cho chính đội ngũ của mình trước khi mang ra tư vấn cho khách hàng.</w:t>
       </w:r>
     </w:p>
     <w:p>

</xml_diff>